<commit_message>
refactor: simplify layout padding, update resume content, and optimize timeline component structure
</commit_message>
<xml_diff>
--- a/public/curriculo/jean-souza-curriculo-pt.docx
+++ b/public/curriculo/jean-souza-curriculo-pt.docx
@@ -7,10 +7,10 @@
         <w:pStyle w:val="Title"/>
       </w:pPr>
       <w:r>
-        <w:t xml:space="preserve">Jean Souza — Engenheiro Front-End Senior</w:t>
-      </w:r>
-    </w:p>
-    <w:bookmarkStart w:id="26" w:name="jean-souza"/>
+        <w:t xml:space="preserve">Jean Souza — Currículo</w:t>
+      </w:r>
+    </w:p>
+    <w:bookmarkStart w:id="27" w:name="jean-souza"/>
     <w:p>
       <w:pPr>
         <w:pStyle w:val="Heading1"/>
@@ -28,7 +28,7 @@
           <w:b/>
           <w:bCs/>
         </w:rPr>
-        <w:t xml:space="preserve">Engenheiro Front-End Senior | React · Next.js · TypeScript</w:t>
+        <w:t xml:space="preserve">Desenvolvedor Frontend Senior | React · Next.js · TypeScript · DevOps</w:t>
       </w:r>
     </w:p>
     <w:p>
@@ -36,7 +36,7 @@
         <w:pStyle w:val="BodyText"/>
       </w:pPr>
       <w:r>
-        <w:t xml:space="preserve">contato@jeansouza.dev | +55 34 991949299 |</w:t>
+        <w:t xml:space="preserve">contato@jeansouza.dev |</w:t>
       </w:r>
       <w:r>
         <w:t xml:space="preserve"> </w:t>
@@ -105,24 +105,17 @@
         <w:pStyle w:val="FirstParagraph"/>
       </w:pPr>
       <w:r>
-        <w:t xml:space="preserve">Mais de 15 anos construindo interfaces de produção — da era do jQuery até React 19 e Next.js 16 App Router com React Server Components e Server Actions em escala. Ao longo desse tempo, entreguei arquiteturas de micro-frontends, design systems e uma biblioteca open source em healthtech, e-commerce e telecom — com deploy no Vercel e em cloud providers, sustentado por pipelines CI/CD com Jest, React Testing Library e Playwright E2E, ajudando times a atingir 92% de cobertura de testes e TDD como prática padrão. O que me diferencia da maioria dos front-ends: opero um homelab em produção com 50+ containers Docker, deploys blue/green e automação extensiva em Python — três anos de operação contínua, zero downtime. Ferramentas de IA (Claude Code, Windsurf, Codex) fazem parte do meu fluxo diário, não são experimento. Inglês C2 — EF SET 82/100.</w:t>
-      </w:r>
-    </w:p>
-    <w:p>
-      <w:r>
-        <w:pict>
-          <v:rect style="width:0;height:1.5pt" o:hralign="center" o:hrstd="t" o:hr="t"/>
-        </w:pict>
+        <w:t xml:space="preserve">Mais de 15 anos desenvolvendo interfaces web em produção, da era jQuery até React 19, Next.js 16 App Router, React Server Components e busca de dados com Suspense. Em healthtech, e-commerce e telecom, entreguei design systems, arquiteturas de micro-frontends em escala e bibliotecas open source. Diferencial real: homelab em produção com 50+ containers Docker, deploys blue/green e automação em Python. Três anos de ops real, não projeto paralelo. Uso Claude Code e Windsurf como parte central do fluxo de trabalho. Inglês C2 certificado (EF SET 82/100).</w:t>
       </w:r>
     </w:p>
     <w:bookmarkEnd w:id="12"/>
-    <w:bookmarkStart w:id="13" w:name="habilidades-técnicas"/>
+    <w:bookmarkStart w:id="14" w:name="competências-técnicas"/>
     <w:p>
       <w:pPr>
         <w:pStyle w:val="Heading2"/>
       </w:pPr>
       <w:r>
-        <w:t xml:space="preserve">Habilidades Técnicas</w:t>
+        <w:t xml:space="preserve">Competências Técnicas</w:t>
       </w:r>
     </w:p>
     <w:p>
@@ -134,13 +127,13 @@
           <w:b/>
           <w:bCs/>
         </w:rPr>
-        <w:t xml:space="preserve">Frontend Core:</w:t>
+        <w:t xml:space="preserve">Front-end:</w:t>
       </w:r>
       <w:r>
         <w:t xml:space="preserve"> </w:t>
       </w:r>
       <w:r>
-        <w:t xml:space="preserve">React 19, Next.js 16, TypeScript, React Server Components, Server Actions, ES6+, HTML5, CSS3, Tailwind CSS v4, Framer Motion, Radix UI, shadcn/ui, React Native, Vue.js</w:t>
+        <w:t xml:space="preserve">React 19, Next.js 16, TypeScript, Redux, Tailwind CSS v4, Framer Motion, Radix UI, shadcn/ui, Web Components, Lit, micro-frontends, React Native, Vue.js</w:t>
       </w:r>
     </w:p>
     <w:p>
@@ -152,13 +145,13 @@
           <w:b/>
           <w:bCs/>
         </w:rPr>
-        <w:t xml:space="preserve">Estado e Dados:</w:t>
+        <w:t xml:space="preserve">Back-end &amp; APIs:</w:t>
       </w:r>
       <w:r>
         <w:t xml:space="preserve"> </w:t>
       </w:r>
       <w:r>
-        <w:t xml:space="preserve">Redux, Zustand, React Query (TanStack), Context API, Zod, REST APIs</w:t>
+        <w:t xml:space="preserve">Node.js, Express, Prisma ORM, PostgreSQL, NextAuth v5, REST APIs, Puppeteer</w:t>
       </w:r>
     </w:p>
     <w:p>
@@ -170,13 +163,13 @@
           <w:b/>
           <w:bCs/>
         </w:rPr>
-        <w:t xml:space="preserve">Arquitetura:</w:t>
+        <w:t xml:space="preserve">Testes:</w:t>
       </w:r>
       <w:r>
         <w:t xml:space="preserve"> </w:t>
       </w:r>
       <w:r>
-        <w:t xml:space="preserve">Micro-frontends, Design Systems, Web Components (Lit), SSR/SSG/ISR, otimização de Core Web Vitals, monorepo</w:t>
+        <w:t xml:space="preserve">Jest, Vitest, React Testing Library, TDD, cobertura de testes</w:t>
       </w:r>
     </w:p>
     <w:p>
@@ -188,13 +181,13 @@
           <w:b/>
           <w:bCs/>
         </w:rPr>
-        <w:t xml:space="preserve">Testes:</w:t>
+        <w:t xml:space="preserve">DevOps &amp; Infra:</w:t>
       </w:r>
       <w:r>
         <w:t xml:space="preserve"> </w:t>
       </w:r>
       <w:r>
-        <w:t xml:space="preserve">Jest, Vitest, Playwright, React Testing Library, TDD, 92% de cobertura de testes</w:t>
+        <w:t xml:space="preserve">Docker, Docker Compose, Traefik v3, CI/CD, blue/green deployment, AWS, GCP, Cloudflare Tunnel, KVM/libvirt, Linux, Bash, Python, MergerFS, Tailscale, UFW, fail2ban</w:t>
       </w:r>
     </w:p>
     <w:p>
@@ -206,13 +199,24 @@
           <w:b/>
           <w:bCs/>
         </w:rPr>
-        <w:t xml:space="preserve">DevOps/Ferramentas:</w:t>
+        <w:t xml:space="preserve">IA &amp; Ferramentas:</w:t>
       </w:r>
       <w:r>
         <w:t xml:space="preserve"> </w:t>
       </w:r>
       <w:r>
-        <w:t xml:space="preserve">Docker, Vercel, CI/CD, Vite, Storybook, ESLint, Conventional Commits, Git Flow, handoff Figma</w:t>
+        <w:t xml:space="preserve">Claude Code (</w:t>
+      </w:r>
+      <w:hyperlink r:id="rId13">
+        <w:r>
+          <w:rPr>
+            <w:rStyle w:val="Hyperlink"/>
+          </w:rPr>
+          <w:t xml:space="preserve">claude-bug-hunt</w:t>
+        </w:r>
+      </w:hyperlink>
+      <w:r>
+        <w:t xml:space="preserve">), Windsurf, Codex, Ollama, n8n, Git, Git Flow, Conventional Commits, Lerna, monorepo</w:t>
       </w:r>
     </w:p>
     <w:p>
@@ -224,57 +228,32 @@
           <w:b/>
           <w:bCs/>
         </w:rPr>
-        <w:t xml:space="preserve">Backend (suporte):</w:t>
+        <w:t xml:space="preserve">Idiomas:</w:t>
       </w:r>
       <w:r>
         <w:t xml:space="preserve"> </w:t>
       </w:r>
       <w:r>
-        <w:t xml:space="preserve">Node.js, Express, Prisma ORM, PostgreSQL, NextAuth v5, Puppeteer</w:t>
-      </w:r>
-    </w:p>
-    <w:p>
-      <w:pPr>
-        <w:pStyle w:val="BodyText"/>
-      </w:pPr>
-      <w:r>
-        <w:rPr>
-          <w:b/>
-          <w:bCs/>
-        </w:rPr>
-        <w:t xml:space="preserve">Acessibilidade:</w:t>
-      </w:r>
-      <w:r>
-        <w:t xml:space="preserve"> </w:t>
-      </w:r>
-      <w:r>
-        <w:t xml:space="preserve">WCAG 2.1 AA, testes com leitores de tela, navegação por teclado</w:t>
-      </w:r>
-    </w:p>
-    <w:p>
-      <w:r>
-        <w:pict>
-          <v:rect style="width:0;height:1.5pt" o:hralign="center" o:hrstd="t" o:hr="t"/>
-        </w:pict>
-      </w:r>
-    </w:p>
-    <w:bookmarkEnd w:id="13"/>
-    <w:bookmarkStart w:id="21" w:name="experiência"/>
+        <w:t xml:space="preserve">Português (nativo) · Inglês C2 — EF SET 82/100</w:t>
+      </w:r>
+    </w:p>
+    <w:bookmarkEnd w:id="14"/>
+    <w:bookmarkStart w:id="22" w:name="experiência-profissional"/>
     <w:p>
       <w:pPr>
         <w:pStyle w:val="Heading2"/>
       </w:pPr>
       <w:r>
-        <w:t xml:space="preserve">Experiência</w:t>
-      </w:r>
-    </w:p>
-    <w:bookmarkStart w:id="14" w:name="zydon-desenvolvedor-front-end-senior"/>
+        <w:t xml:space="preserve">Experiência Profissional</w:t>
+      </w:r>
+    </w:p>
+    <w:bookmarkStart w:id="15" w:name="X3e2bbd97fb2cb497d53ecf37e4a9844848245bf"/>
     <w:p>
       <w:pPr>
         <w:pStyle w:val="Heading3"/>
       </w:pPr>
       <w:r>
-        <w:t xml:space="preserve">Zydon · Desenvolvedor Front-End Senior</w:t>
+        <w:t xml:space="preserve">Zydon · Desenvolvedor Front-End Senior (React/Next.js/TypeScript)</w:t>
       </w:r>
     </w:p>
     <w:p>
@@ -291,14 +270,6 @@
     </w:p>
     <w:p>
       <w:pPr>
-        <w:pStyle w:val="BodyText"/>
-      </w:pPr>
-      <w:r>
-        <w:t xml:space="preserve">A Zydon é uma empresa brasileira de SaaS. Tech lead de front-end responsável por estabelecer padrões de engenharia em um ecossistema de micro-frontends multi-repo.</w:t>
-      </w:r>
-    </w:p>
-    <w:p>
-      <w:pPr>
         <w:pStyle w:val="Compact"/>
         <w:numPr>
           <w:ilvl w:val="0"/>
@@ -306,7 +277,7 @@
         </w:numPr>
       </w:pPr>
       <w:r>
-        <w:t xml:space="preserve">Suíte de testes criada do zero em ambiente multi-repo de micro-frontends: 70% de cobertura total onde antes não existia nenhuma, com Playwright E2E integrado ao CI para validação automática de fluxos críticos em cada pull request</w:t>
+        <w:t xml:space="preserve">Suite de testes criada do zero num ambiente multi-repo de micro-frontends: 70% de cobertura total onde antes não existia nenhuma</w:t>
       </w:r>
     </w:p>
     <w:p>
@@ -330,7 +301,7 @@
         </w:numPr>
       </w:pPr>
       <w:r>
-        <w:t xml:space="preserve">Taxa de regressão de bugs reduzida de ~25% para abaixo de 5% por meio de code reviews padronizados, validações automáticas no CI e validação de schemas com Zod nos contratos de API</w:t>
+        <w:t xml:space="preserve">Taxa de regressão de bugs caiu de ~25% para abaixo de 5%, com padronização de code reviews e validações automáticas de CI em pull requests</w:t>
       </w:r>
     </w:p>
     <w:p>
@@ -342,48 +313,11 @@
         </w:numPr>
       </w:pPr>
       <w:r>
-        <w:t xml:space="preserve">Refatoração crítica de gerenciamento de estado com Redux e Next.js 16 App Router — React Server Components, Server Actions e estratégia SSR/SSG por rota — reduzindo footprint de memória client-side e melhorando os Core Web Vitals do portal principal</w:t>
-      </w:r>
-    </w:p>
-    <w:p>
-      <w:pPr>
-        <w:pStyle w:val="Compact"/>
-        <w:numPr>
-          <w:ilvl w:val="0"/>
-          <w:numId w:val="1001"/>
-        </w:numPr>
-      </w:pPr>
-      <w:r>
-        <w:t xml:space="preserve">Modelagem e desacoplamento de micro-frontends no ecossistema multi-repo, estabelecendo contratos de comunicação agnósticos e autonomia total de deploy para diferentes squads; mentoria de engenheiros em decisões de arquitetura e padrões de revisão</w:t>
-      </w:r>
-    </w:p>
-    <w:p>
-      <w:pPr>
-        <w:pStyle w:val="FirstParagraph"/>
-      </w:pPr>
-      <w:r>
-        <w:rPr>
-          <w:b/>
-          <w:bCs/>
-        </w:rPr>
-        <w:t xml:space="preserve">Habilidades:</w:t>
-      </w:r>
-      <w:r>
-        <w:t xml:space="preserve"> </w:t>
-      </w:r>
-      <w:r>
-        <w:t xml:space="preserve">React 19, Next.js 16, TypeScript, Redux, Playwright, Zod, CI/CD, micro-frontends, revisão de código, Figma</w:t>
-      </w:r>
-    </w:p>
-    <w:p>
-      <w:r>
-        <w:pict>
-          <v:rect style="width:0;height:1.5pt" o:hralign="center" o:hrstd="t" o:hr="t"/>
-        </w:pict>
-      </w:r>
-    </w:p>
-    <w:bookmarkEnd w:id="14"/>
-    <w:bookmarkStart w:id="15" w:name="X7dcb267eff88f5edcd3aaec4baca5a7ec9ed248"/>
+        <w:t xml:space="preserve">Introdução de workflows com IA (Claude Code, Windsurf, Codex) no processo do time: menos retrabalho, ciclos de revisão mais curtos e entregas mais confiáveis</w:t>
+      </w:r>
+    </w:p>
+    <w:bookmarkEnd w:id="15"/>
+    <w:bookmarkStart w:id="16" w:name="X7dcb267eff88f5edcd3aaec4baca5a7ec9ed248"/>
     <w:p>
       <w:pPr>
         <w:pStyle w:val="Heading3"/>
@@ -406,14 +340,6 @@
     </w:p>
     <w:p>
       <w:pPr>
-        <w:pStyle w:val="BodyText"/>
-      </w:pPr>
-      <w:r>
-        <w:t xml:space="preserve">A Mutant é uma consultoria brasileira de transformação digital; este projeto foi para a Vivo, uma das maiores operadoras de telecom do Brasil.</w:t>
-      </w:r>
-    </w:p>
-    <w:p>
-      <w:pPr>
         <w:pStyle w:val="Compact"/>
         <w:numPr>
           <w:ilvl w:val="0"/>
@@ -421,7 +347,7 @@
         </w:numPr>
       </w:pPr>
       <w:r>
-        <w:t xml:space="preserve">Liderança técnica da equipe na criação de uma biblioteca de Web Components (Lit) para o cliente Vivo — interoperável entre Angular e React em arquitetura de micro-frontends, sem necessidade de reescritas por framework</w:t>
+        <w:t xml:space="preserve">Liderança técnica da equipe na criação de uma biblioteca de Web Components (Lit) para o cliente Vivo, interoperável entre Angular e React em arquitetura de micro-frontends sem necessidade de reescritas por framework</w:t>
       </w:r>
     </w:p>
     <w:p>
@@ -433,7 +359,7 @@
         </w:numPr>
       </w:pPr>
       <w:r>
-        <w:t xml:space="preserve">Todos os componentes entregues em conformidade com WCAG 2.1 AA, tornando a biblioteca acessível a tecnologias assistivas e reduzindo o risco legal do cliente</w:t>
+        <w:t xml:space="preserve">100% dos componentes em conformidade WCAG 2.1 AA: biblioteca acessível a tecnologias assistivas, reduzindo o risco legal do cliente</w:t>
       </w:r>
     </w:p>
     <w:p>
@@ -445,48 +371,11 @@
         </w:numPr>
       </w:pPr>
       <w:r>
-        <w:t xml:space="preserve">Biblioteca arquitetada para agnosticismo total de framework — componentes integrados de forma transparente de React para Angular, com base em conhecimento profundo do funcionamento interno de ambas as bibliotecas</w:t>
-      </w:r>
-    </w:p>
-    <w:p>
-      <w:pPr>
-        <w:pStyle w:val="Compact"/>
-        <w:numPr>
-          <w:ilvl w:val="0"/>
-          <w:numId w:val="1002"/>
-        </w:numPr>
-      </w:pPr>
-      <w:r>
-        <w:t xml:space="preserve">Documentação interativa da biblioteca de Web Components com Storybook — catálogo de componentes adotado como referência principal por times de design e engenharia, eliminando a descoberta informal ad-hoc</w:t>
-      </w:r>
-    </w:p>
-    <w:p>
-      <w:pPr>
-        <w:pStyle w:val="FirstParagraph"/>
-      </w:pPr>
-      <w:r>
-        <w:rPr>
-          <w:b/>
-          <w:bCs/>
-        </w:rPr>
-        <w:t xml:space="preserve">Habilidades:</w:t>
-      </w:r>
-      <w:r>
-        <w:t xml:space="preserve"> </w:t>
-      </w:r>
-      <w:r>
-        <w:t xml:space="preserve">Web Components, Lit, TypeScript, Storybook, acessibilidade, WCAG, micro-frontends, Vite, Figma, design system</w:t>
-      </w:r>
-    </w:p>
-    <w:p>
-      <w:r>
-        <w:pict>
-          <v:rect style="width:0;height:1.5pt" o:hralign="center" o:hrstd="t" o:hr="t"/>
-        </w:pict>
-      </w:r>
-    </w:p>
-    <w:bookmarkEnd w:id="15"/>
-    <w:bookmarkStart w:id="16" w:name="X9a564c7de2def4468d9f925f67fa58a39f81e92"/>
+        <w:t xml:space="preserve">Monorepo estruturado com Lerna para que cada squad importasse apenas o necessário, reduzindo bundle size e acoplamento entre times</w:t>
+      </w:r>
+    </w:p>
+    <w:bookmarkEnd w:id="16"/>
+    <w:bookmarkStart w:id="17" w:name="X9a564c7de2def4468d9f925f67fa58a39f81e92"/>
     <w:p>
       <w:pPr>
         <w:pStyle w:val="Heading3"/>
@@ -509,14 +398,6 @@
     </w:p>
     <w:p>
       <w:pPr>
-        <w:pStyle w:val="BodyText"/>
-      </w:pPr>
-      <w:r>
-        <w:t xml:space="preserve">O Runrun.it é um SaaS brasileiro de gestão de projetos para times de médio e grande porte; contratado para modernizar uma base legada em Backbone/Marionette.</w:t>
-      </w:r>
-    </w:p>
-    <w:p>
-      <w:pPr>
         <w:pStyle w:val="Compact"/>
         <w:numPr>
           <w:ilvl w:val="0"/>
@@ -524,7 +405,7 @@
         </w:numPr>
       </w:pPr>
       <w:r>
-        <w:t xml:space="preserve">Ferramenta de ações em massa desenvolvida com React e hooks customizados, adotada em múltiplos fluxos críticos do produto — hooks abstraíam o legado em Backbone para que novos devs produzissem sem precisar aprender a stack antiga</w:t>
+        <w:t xml:space="preserve">Ferramenta de ações em massa desenvolvida com React e hooks customizados, adotada em múltiplos fluxos críticos do produto; os hooks abstraíam o legado em Backbone para devs novos não precisarem aprender a stack antiga</w:t>
       </w:r>
     </w:p>
     <w:p>
@@ -536,7 +417,7 @@
         </w:numPr>
       </w:pPr>
       <w:r>
-        <w:t xml:space="preserve">Módulos Backbone + Marionette migrados para React: onboarding mais rápido, custo de manutenção reduzido, arquitetura mais sustentável; sessões de mentoria conduzidas para acelerar a integração de novos desenvolvedores</w:t>
+        <w:t xml:space="preserve">Definição da estratégia de migração incremental de Backbone → React com Webpack e code-splitting por rota: novas features React entregues sem reescrita total, preservando os fluxos existentes e melhorando os scores de performance no Lighthouse</w:t>
       </w:r>
     </w:p>
     <w:p>
@@ -548,48 +429,11 @@
         </w:numPr>
       </w:pPr>
       <w:r>
-        <w:t xml:space="preserve">Padrões de qualidade (ESLint, diretrizes de code review, arquitetura de hooks) mantidos pelo time após o encerramento do contrato — evidência de impacto duradouro no processo</w:t>
-      </w:r>
-    </w:p>
-    <w:p>
-      <w:pPr>
-        <w:pStyle w:val="Compact"/>
-        <w:numPr>
-          <w:ilvl w:val="0"/>
-          <w:numId w:val="1003"/>
-        </w:numPr>
-      </w:pPr>
-      <w:r>
-        <w:t xml:space="preserve">React Query (TanStack) adotado para gerenciamento de estado do servidor — substituição de lógica manual de fetch por data fetching declarativo, reduzindo boilerplate e melhorando a consistência de cache</w:t>
-      </w:r>
-    </w:p>
-    <w:p>
-      <w:pPr>
-        <w:pStyle w:val="FirstParagraph"/>
-      </w:pPr>
-      <w:r>
-        <w:rPr>
-          <w:b/>
-          <w:bCs/>
-        </w:rPr>
-        <w:t xml:space="preserve">Habilidades:</w:t>
-      </w:r>
-      <w:r>
-        <w:t xml:space="preserve"> </w:t>
-      </w:r>
-      <w:r>
-        <w:t xml:space="preserve">React, TypeScript, React Query, hooks, ESLint, revisão de código, mentoria, migração React, Figma</w:t>
-      </w:r>
-    </w:p>
-    <w:p>
-      <w:r>
-        <w:pict>
-          <v:rect style="width:0;height:1.5pt" o:hralign="center" o:hrstd="t" o:hr="t"/>
-        </w:pict>
-      </w:r>
-    </w:p>
-    <w:bookmarkEnd w:id="16"/>
-    <w:bookmarkStart w:id="17" w:name="X0fb4dc30f5303c2f2d84ec2be9e495aea57cbc5"/>
+        <w:t xml:space="preserve">Padrões de qualidade estabelecidos (ESLint, code review, arquitetura de hooks) que o time continuou usando depois da minha saída</w:t>
+      </w:r>
+    </w:p>
+    <w:bookmarkEnd w:id="17"/>
+    <w:bookmarkStart w:id="18" w:name="X0fb4dc30f5303c2f2d84ec2be9e495aea57cbc5"/>
     <w:p>
       <w:pPr>
         <w:pStyle w:val="Heading3"/>
@@ -612,14 +456,6 @@
     </w:p>
     <w:p>
       <w:pPr>
-        <w:pStyle w:val="BodyText"/>
-      </w:pPr>
-      <w:r>
-        <w:t xml:space="preserve">O Luizalabs é o braço de engenharia do Magalu, maior varejista do Brasil — um dos ambientes de engenharia de e-commerce mais exigentes do país.</w:t>
-      </w:r>
-    </w:p>
-    <w:p>
-      <w:pPr>
         <w:pStyle w:val="Compact"/>
         <w:numPr>
           <w:ilvl w:val="0"/>
@@ -627,7 +463,7 @@
         </w:numPr>
       </w:pPr>
       <w:r>
-        <w:t xml:space="preserve">Liderança colaborativa que ajudou o time a atingir 92% de cobertura de testes com Jest + React Testing Library no projeto principal — marco que desbloqueou o pipeline de continuous delivery da empresa e virou referência interna de qualidade</w:t>
+        <w:t xml:space="preserve">92% de cobertura de testes com Jest + RTL no projeto principal, o número que desbloqueou a adoção do pipeline de continuous delivery da empresa e virou referência interna</w:t>
       </w:r>
     </w:p>
     <w:p>
@@ -639,7 +475,7 @@
         </w:numPr>
       </w:pPr>
       <w:r>
-        <w:t xml:space="preserve">Micro-frontends de alta escala arquitetados e integrados à plataforma unificada do Magalu, com padrões de orquestração client-side, compartilhamento de estado seguro e fluxos de release automatizados via Git Flow e Conventional Commits</w:t>
+        <w:t xml:space="preserve">Micro-frontends arquitetados e integrados à plataforma interna do Magalu, com Git Flow e Conventional Commits como padrão de entrega</w:t>
       </w:r>
     </w:p>
     <w:p>
@@ -651,48 +487,11 @@
         </w:numPr>
       </w:pPr>
       <w:r>
-        <w:t xml:space="preserve">Projeto legado sem cobertura alguma recebeu testes unitários e pipeline de deploy automatizado, reduzindo o tempo de release de 2 dias (manual) para apenas 1 hora com zero regressões</w:t>
-      </w:r>
-    </w:p>
-    <w:p>
-      <w:pPr>
-        <w:pStyle w:val="Compact"/>
-        <w:numPr>
-          <w:ilvl w:val="0"/>
-          <w:numId w:val="1004"/>
-        </w:numPr>
-      </w:pPr>
-      <w:r>
-        <w:t xml:space="preserve">Data fetching padronizado com React Query (TanStack) em toda a equipe — estratégia de cache unificada e redução de lógica assíncrona duplicada na aplicação principal do Magalu</w:t>
-      </w:r>
-    </w:p>
-    <w:p>
-      <w:pPr>
-        <w:pStyle w:val="FirstParagraph"/>
-      </w:pPr>
-      <w:r>
-        <w:rPr>
-          <w:b/>
-          <w:bCs/>
-        </w:rPr>
-        <w:t xml:space="preserve">Habilidades:</w:t>
-      </w:r>
-      <w:r>
-        <w:t xml:space="preserve"> </w:t>
-      </w:r>
-      <w:r>
-        <w:t xml:space="preserve">React, TypeScript, Jest, React Testing Library, TDD, micro-frontends, React Query, CI/CD, Git Flow, Figma</w:t>
-      </w:r>
-    </w:p>
-    <w:p>
-      <w:r>
-        <w:pict>
-          <v:rect style="width:0;height:1.5pt" o:hralign="center" o:hrstd="t" o:hr="t"/>
-        </w:pict>
-      </w:r>
-    </w:p>
-    <w:bookmarkEnd w:id="17"/>
-    <w:bookmarkStart w:id="19" w:name="X149d114de53e775d76ab299d8523a02e2c889a9"/>
+        <w:t xml:space="preserve">Projeto legado sem cobertura alguma recebeu testes unitários e passou a ter deploy automatizado, eliminando o risco de regressão manual em cada release</w:t>
+      </w:r>
+    </w:p>
+    <w:bookmarkEnd w:id="18"/>
+    <w:bookmarkStart w:id="20" w:name="X149d114de53e775d76ab299d8523a02e2c889a9"/>
     <w:p>
       <w:pPr>
         <w:pStyle w:val="Heading3"/>
@@ -715,27 +514,13 @@
     </w:p>
     <w:p>
       <w:pPr>
-        <w:pStyle w:val="BodyText"/>
-      </w:pPr>
-      <w:r>
-        <w:t xml:space="preserve">A Vitta é uma healthtech brasileira com SaaS de gestão clínica para hospitais e clínicas.</w:t>
-      </w:r>
-    </w:p>
-    <w:p>
-      <w:pPr>
         <w:pStyle w:val="Compact"/>
         <w:numPr>
           <w:ilvl w:val="0"/>
           <w:numId w:val="1005"/>
         </w:numPr>
       </w:pPr>
-      <w:r>
-        <w:t xml:space="preserve">Criação e liderança do</w:t>
-      </w:r>
-      <w:r>
-        <w:t xml:space="preserve"> </w:t>
-      </w:r>
-      <w:hyperlink r:id="rId18">
+      <w:hyperlink r:id="rId19">
         <w:r>
           <w:rPr>
             <w:rStyle w:val="Hyperlink"/>
@@ -744,7 +529,10 @@
         </w:r>
       </w:hyperlink>
       <w:r>
-        <w:t xml:space="preserve">, biblioteca open source de componentes Vue documentada com Storybook — base sobre a qual o design system da empresa foi construído, reduzindo inconsistências de UI em todas as aplicações</w:t>
+        <w:t xml:space="preserve"> </w:t>
+      </w:r>
+      <w:r>
+        <w:t xml:space="preserve">criado e liderado como projeto open source: biblioteca de componentes Vue que virou a base do design system da empresa</w:t>
       </w:r>
     </w:p>
     <w:p>
@@ -756,7 +544,7 @@
         </w:numPr>
       </w:pPr>
       <w:r>
-        <w:t xml:space="preserve">Microserviço Node + Express + Puppeteer para centralizar a geração de documentos imprimíveis em toda a plataforma — usado em 100% dos fluxos clínicos por médicos e pacientes</w:t>
+        <w:t xml:space="preserve">Design system interno desenvolvido para unificar a linguagem visual entre as aplicações: menos inconsistência de UI, mais velocidade para novas features</w:t>
       </w:r>
     </w:p>
     <w:p>
@@ -768,7 +556,7 @@
         </w:numPr>
       </w:pPr>
       <w:r>
-        <w:t xml:space="preserve">API Node + TypeScript para retorno de registros médicos em conformidade com a LGPD, garantindo proteção de dados antes mesmo da lei entrar em vigor</w:t>
+        <w:t xml:space="preserve">Microserviço Node + Express + Puppeteer que centraliza a geração de documentos imprimíveis de toda a plataforma, usado em 100% dos fluxos clínicos por médicos e pacientes</w:t>
       </w:r>
     </w:p>
     <w:p>
@@ -780,19 +568,76 @@
         </w:numPr>
       </w:pPr>
       <w:r>
-        <w:t xml:space="preserve">Otimização de queries relacionais complexas em PostgreSQL para o microserviço clínico, reduzindo a latência de resposta das rotas em até 30%</w:t>
-      </w:r>
-    </w:p>
-    <w:p>
-      <w:pPr>
-        <w:pStyle w:val="Compact"/>
-        <w:numPr>
-          <w:ilvl w:val="0"/>
-          <w:numId w:val="1005"/>
-        </w:numPr>
-      </w:pPr>
-      <w:r>
-        <w:t xml:space="preserve">SSR em Vue e dados estruturados implementados no portal institucional da Vitta, melhorando os Core Web Vitals e gerando aumento expressivo de tráfego orgânico</w:t>
+        <w:t xml:space="preserve">API Node + TypeScript para retorno de registros médicos em conformidade com a LGPD, com privacidade de dados garantida antes mesmo da lei entrar em vigor</w:t>
+      </w:r>
+    </w:p>
+    <w:bookmarkEnd w:id="20"/>
+    <w:bookmarkStart w:id="21" w:name="X105222d714bdf81450954530402f9612d2701f1"/>
+    <w:p>
+      <w:pPr>
+        <w:pStyle w:val="Heading3"/>
+      </w:pPr>
+      <w:r>
+        <w:t xml:space="preserve">LuxControl Automação Residencial · Desenvolvedor Front-End Senior</w:t>
+      </w:r>
+    </w:p>
+    <w:p>
+      <w:pPr>
+        <w:pStyle w:val="FirstParagraph"/>
+      </w:pPr>
+      <w:r>
+        <w:rPr>
+          <w:i/>
+          <w:iCs/>
+        </w:rPr>
+        <w:t xml:space="preserve">abril 2012 – julho 2017 · Uberlândia, MG</w:t>
+      </w:r>
+    </w:p>
+    <w:p>
+      <w:pPr>
+        <w:pStyle w:val="Compact"/>
+        <w:numPr>
+          <w:ilvl w:val="0"/>
+          <w:numId w:val="1006"/>
+        </w:numPr>
+      </w:pPr>
+      <w:r>
+        <w:t xml:space="preserve">5 anos liderando o front-end de um sistema embarcado para automação residencial, em ambiente sem internet e com restrições severas de performance e segurança</w:t>
+      </w:r>
+    </w:p>
+    <w:p>
+      <w:pPr>
+        <w:pStyle w:val="Compact"/>
+        <w:numPr>
+          <w:ilvl w:val="0"/>
+          <w:numId w:val="1006"/>
+        </w:numPr>
+      </w:pPr>
+      <w:r>
+        <w:t xml:space="preserve">Interface responsiva construída e mantida para touchscreens, painéis de parede e clientes mobile, todos em hardware embarcado com restrições severas de CPU/memória e sem acesso externo à rede</w:t>
+      </w:r>
+    </w:p>
+    <w:p>
+      <w:pPr>
+        <w:pStyle w:val="Compact"/>
+        <w:numPr>
+          <w:ilvl w:val="0"/>
+          <w:numId w:val="1006"/>
+        </w:numPr>
+      </w:pPr>
+      <w:r>
+        <w:t xml:space="preserve">React e consumo de APIs REST introduzidos no sistema legado sem interromper o serviço para clientes já em produção</w:t>
+      </w:r>
+    </w:p>
+    <w:bookmarkEnd w:id="21"/>
+    <w:bookmarkEnd w:id="22"/>
+    <w:bookmarkStart w:id="23" w:name="infraestrutura-devops"/>
+    <w:p>
+      <w:pPr>
+        <w:pStyle w:val="Heading2"/>
+      </w:pPr>
+      <w:r>
+        <w:t xml:space="preserve">Infraestrutura &amp; DevOps</w:t>
       </w:r>
     </w:p>
     <w:p>
@@ -804,110 +649,147 @@
           <w:b/>
           <w:bCs/>
         </w:rPr>
-        <w:t xml:space="preserve">Habilidades:</w:t>
+        <w:t xml:space="preserve">Homelab em produção</w:t>
       </w:r>
       <w:r>
         <w:t xml:space="preserve"> </w:t>
       </w:r>
-      <w:r>
-        <w:t xml:space="preserve">Vue.js, TypeScript, Node.js, PostgreSQL, Puppeteer, design system, Storybook, WCAG, SSR, LGPD</w:t>
-      </w:r>
-    </w:p>
-    <w:p>
-      <w:r>
-        <w:pict>
-          <v:rect style="width:0;height:1.5pt" o:hralign="center" o:hrstd="t" o:hr="t"/>
-        </w:pict>
-      </w:r>
-    </w:p>
-    <w:bookmarkEnd w:id="19"/>
-    <w:bookmarkStart w:id="20" w:name="X105222d714bdf81450954530402f9612d2701f1"/>
-    <w:p>
-      <w:pPr>
-        <w:pStyle w:val="Heading3"/>
-      </w:pPr>
-      <w:r>
-        <w:t xml:space="preserve">LuxControl Automação Residencial · Desenvolvedor Front-End Senior</w:t>
-      </w:r>
-    </w:p>
-    <w:p>
-      <w:pPr>
-        <w:pStyle w:val="FirstParagraph"/>
-      </w:pPr>
       <w:r>
         <w:rPr>
           <w:i/>
           <w:iCs/>
         </w:rPr>
-        <w:t xml:space="preserve">abril 2012 – julho 2017 · Uberlândia, MG</w:t>
-      </w:r>
-    </w:p>
-    <w:p>
-      <w:pPr>
-        <w:pStyle w:val="BodyText"/>
-      </w:pPr>
-      <w:r>
-        <w:t xml:space="preserve">A LuxControl é uma empresa brasileira de automação residencial; liderança do front-end por 5 anos em projeto de sistema embarcado em ambiente isolado e de alta restrição.</w:t>
-      </w:r>
-    </w:p>
-    <w:p>
-      <w:pPr>
-        <w:pStyle w:val="Compact"/>
-        <w:numPr>
-          <w:ilvl w:val="0"/>
-          <w:numId w:val="1006"/>
-        </w:numPr>
-      </w:pPr>
-      <w:r>
-        <w:t xml:space="preserve">Liderança do front-end de um sistema embarcado para automação residencial por 5 anos — ambiente sem internet, restrições severas de performance, sem margem para erros de deploy</w:t>
-      </w:r>
-    </w:p>
-    <w:p>
-      <w:pPr>
-        <w:pStyle w:val="Compact"/>
-        <w:numPr>
-          <w:ilvl w:val="0"/>
-          <w:numId w:val="1006"/>
-        </w:numPr>
-      </w:pPr>
-      <w:r>
-        <w:t xml:space="preserve">Conformidade total com WCAG mantida ao longo do produto, acessível a todos os perfis de usuário independente de dispositivo assistivo</w:t>
-      </w:r>
-    </w:p>
-    <w:p>
-      <w:pPr>
-        <w:pStyle w:val="Compact"/>
-        <w:numPr>
-          <w:ilvl w:val="0"/>
-          <w:numId w:val="1006"/>
-        </w:numPr>
-      </w:pPr>
-      <w:r>
-        <w:t xml:space="preserve">React e consumo de APIs REST introduzidos em sistema legado com usuários ativos em produção — migração sem downtime e sem interrupção para clientes</w:t>
-      </w:r>
-    </w:p>
-    <w:p>
-      <w:pPr>
-        <w:pStyle w:val="Compact"/>
-        <w:numPr>
-          <w:ilvl w:val="0"/>
-          <w:numId w:val="1006"/>
-        </w:numPr>
-      </w:pPr>
-      <w:r>
-        <w:t xml:space="preserve">Mecanismo customizado de cache client-side desenvolvido para mitigar latência de rede no hardware embarcado sem internet, melhorando a performance percebida sem alterações no servidor</w:t>
-      </w:r>
-    </w:p>
-    <w:p>
-      <w:pPr>
-        <w:pStyle w:val="Compact"/>
-        <w:numPr>
-          <w:ilvl w:val="0"/>
-          <w:numId w:val="1006"/>
-        </w:numPr>
-      </w:pPr>
-      <w:r>
-        <w:t xml:space="preserve">Site institucional da LuxControl otimizado para SEO e Core Web Vitals (LCP, FID, CLS), elevando pontuações no Google Lighthouse para acima de 95 e expandindo a presença digital da marca</w:t>
+        <w:t xml:space="preserve">(3 anos de operação contínua)</w:t>
+      </w:r>
+    </w:p>
+    <w:p>
+      <w:pPr>
+        <w:pStyle w:val="Compact"/>
+        <w:numPr>
+          <w:ilvl w:val="0"/>
+          <w:numId w:val="1007"/>
+        </w:numPr>
+      </w:pPr>
+      <w:r>
+        <w:t xml:space="preserve">50+ containers Docker em múltiplas stacks independentes, gerenciados com Docker Compose</w:t>
+      </w:r>
+    </w:p>
+    <w:p>
+      <w:pPr>
+        <w:pStyle w:val="Compact"/>
+        <w:numPr>
+          <w:ilvl w:val="0"/>
+          <w:numId w:val="1007"/>
+        </w:numPr>
+      </w:pPr>
+      <w:r>
+        <w:t xml:space="preserve">Traefik como reverse proxy com HTTPS automático e autenticação por serviço</w:t>
+      </w:r>
+    </w:p>
+    <w:p>
+      <w:pPr>
+        <w:pStyle w:val="Compact"/>
+        <w:numPr>
+          <w:ilvl w:val="0"/>
+          <w:numId w:val="1007"/>
+        </w:numPr>
+      </w:pPr>
+      <w:r>
+        <w:t xml:space="preserve">Blue/green deployment com zero-downtime para aplicação Next.js 16 em produção</w:t>
+      </w:r>
+    </w:p>
+    <w:p>
+      <w:pPr>
+        <w:pStyle w:val="Compact"/>
+        <w:numPr>
+          <w:ilvl w:val="0"/>
+          <w:numId w:val="1007"/>
+        </w:numPr>
+      </w:pPr>
+      <w:r>
+        <w:t xml:space="preserve">Cloudflare Tunnel para exposição de serviços sem portas abertas no firewall</w:t>
+      </w:r>
+    </w:p>
+    <w:p>
+      <w:pPr>
+        <w:pStyle w:val="Compact"/>
+        <w:numPr>
+          <w:ilvl w:val="0"/>
+          <w:numId w:val="1007"/>
+        </w:numPr>
+      </w:pPr>
+      <w:r>
+        <w:t xml:space="preserve">VM de roteador/firewall customizado com IDS e isolamento de rede IoT</w:t>
+      </w:r>
+    </w:p>
+    <w:p>
+      <w:pPr>
+        <w:pStyle w:val="Compact"/>
+        <w:numPr>
+          <w:ilvl w:val="0"/>
+          <w:numId w:val="1007"/>
+        </w:numPr>
+      </w:pPr>
+      <w:r>
+        <w:t xml:space="preserve">Pool de 17TB com rebalanceamento automatizado em Python</w:t>
+      </w:r>
+    </w:p>
+    <w:p>
+      <w:pPr>
+        <w:pStyle w:val="Compact"/>
+        <w:numPr>
+          <w:ilvl w:val="0"/>
+          <w:numId w:val="1007"/>
+        </w:numPr>
+      </w:pPr>
+      <w:r>
+        <w:t xml:space="preserve">Tailscale VPN com acesso remoto seguro entre dispositivos</w:t>
+      </w:r>
+    </w:p>
+    <w:p>
+      <w:pPr>
+        <w:pStyle w:val="Compact"/>
+        <w:numPr>
+          <w:ilvl w:val="0"/>
+          <w:numId w:val="1007"/>
+        </w:numPr>
+      </w:pPr>
+      <w:r>
+        <w:t xml:space="preserve">Segurança em camadas: autenticação no proxy reverso, filtragem DNS, isolamento de containers</w:t>
+      </w:r>
+    </w:p>
+    <w:p>
+      <w:pPr>
+        <w:pStyle w:val="Compact"/>
+        <w:numPr>
+          <w:ilvl w:val="0"/>
+          <w:numId w:val="1007"/>
+        </w:numPr>
+      </w:pPr>
+      <w:r>
+        <w:t xml:space="preserve">Automação em Python: monitoramento IoT, alertas, SMART monitoring, health checks, automação de mídia</w:t>
+      </w:r>
+    </w:p>
+    <w:p>
+      <w:pPr>
+        <w:pStyle w:val="Compact"/>
+        <w:numPr>
+          <w:ilvl w:val="0"/>
+          <w:numId w:val="1007"/>
+        </w:numPr>
+      </w:pPr>
+      <w:r>
+        <w:t xml:space="preserve">GPU dedicada para transcodificação e inferência local de LLMs via Ollama</w:t>
+      </w:r>
+    </w:p>
+    <w:bookmarkEnd w:id="23"/>
+    <w:bookmarkStart w:id="25" w:name="projetos-pessoais"/>
+    <w:p>
+      <w:pPr>
+        <w:pStyle w:val="Heading2"/>
+      </w:pPr>
+      <w:r>
+        <w:t xml:space="preserve">Projetos Pessoais</w:t>
       </w:r>
     </w:p>
     <w:p>
@@ -919,202 +801,89 @@
           <w:b/>
           <w:bCs/>
         </w:rPr>
-        <w:t xml:space="preserve">Habilidades:</w:t>
+        <w:t xml:space="preserve">Pigui</w:t>
       </w:r>
       <w:r>
         <w:t xml:space="preserve"> </w:t>
       </w:r>
-      <w:r>
-        <w:t xml:space="preserve">React, REST APIs, WCAG, acessibilidade, Core Web Vitals, otimização de performance, sistemas embarcados</w:t>
-      </w:r>
-    </w:p>
-    <w:p>
-      <w:r>
-        <w:pict>
-          <v:rect style="width:0;height:1.5pt" o:hralign="center" o:hrstd="t" o:hr="t"/>
-        </w:pict>
-      </w:r>
-    </w:p>
-    <w:bookmarkEnd w:id="20"/>
-    <w:bookmarkEnd w:id="21"/>
-    <w:bookmarkStart w:id="22" w:name="homelab-em-produção"/>
-    <w:p>
-      <w:pPr>
-        <w:pStyle w:val="Heading2"/>
-      </w:pPr>
-      <w:r>
-        <w:t xml:space="preserve">Homelab em Produção</w:t>
-      </w:r>
-    </w:p>
-    <w:p>
-      <w:pPr>
-        <w:pStyle w:val="FirstParagraph"/>
-      </w:pPr>
       <w:r>
         <w:rPr>
           <w:i/>
           <w:iCs/>
         </w:rPr>
-        <w:t xml:space="preserve">3 anos de operação contínua · 99,9% de uptime</w:t>
-      </w:r>
-    </w:p>
-    <w:p>
-      <w:pPr>
-        <w:pStyle w:val="Compact"/>
-        <w:numPr>
-          <w:ilvl w:val="0"/>
-          <w:numId w:val="1007"/>
-        </w:numPr>
-      </w:pPr>
-      <w:r>
-        <w:t xml:space="preserve">50+ containers Docker em múltiplas stacks independentes gerenciadas com Docker Compose; Traefik como reverse proxy com HTTPS automático e autenticação por serviço</w:t>
-      </w:r>
-    </w:p>
-    <w:p>
-      <w:pPr>
-        <w:pStyle w:val="Compact"/>
-        <w:numPr>
-          <w:ilvl w:val="0"/>
-          <w:numId w:val="1007"/>
-        </w:numPr>
-      </w:pPr>
-      <w:r>
-        <w:t xml:space="preserve">Blue/green deployment com zero-downtime para aplicação Next.js 16 em produção; Cloudflare Tunnel para exposição de serviços sem portas abertas no firewall</w:t>
-      </w:r>
-    </w:p>
-    <w:p>
-      <w:pPr>
-        <w:pStyle w:val="Compact"/>
-        <w:numPr>
-          <w:ilvl w:val="0"/>
-          <w:numId w:val="1007"/>
-        </w:numPr>
-      </w:pPr>
-      <w:r>
-        <w:t xml:space="preserve">Manutenção autônoma de infraestrutura self-hosted com 99,9% de uptime em 3 anos, com backups locais e offsite criptografados automatizados e alertas de saúde de disco SMART</w:t>
-      </w:r>
-    </w:p>
-    <w:p>
-      <w:pPr>
-        <w:pStyle w:val="Compact"/>
-        <w:numPr>
-          <w:ilvl w:val="0"/>
-          <w:numId w:val="1007"/>
-        </w:numPr>
-      </w:pPr>
-      <w:r>
-        <w:t xml:space="preserve">Pool de 17TB com rebalanceamento automatizado em Python; Tailscale VPN com acesso remoto seguro entre dispositivos; segurança em camadas com autenticação no proxy reverso, filtragem DNS e isolamento de containers</w:t>
-      </w:r>
-    </w:p>
-    <w:p>
-      <w:pPr>
-        <w:pStyle w:val="Compact"/>
-        <w:numPr>
-          <w:ilvl w:val="0"/>
-          <w:numId w:val="1007"/>
-        </w:numPr>
-      </w:pPr>
-      <w:r>
-        <w:t xml:space="preserve">GPU dedicada para transcodificação de vídeo e inferência local de LLMs via Ollama</w:t>
-      </w:r>
-    </w:p>
-    <w:p>
-      <w:r>
-        <w:pict>
-          <v:rect style="width:0;height:1.5pt" o:hralign="center" o:hrstd="t" o:hr="t"/>
-        </w:pict>
-      </w:r>
-    </w:p>
-    <w:bookmarkEnd w:id="22"/>
-    <w:bookmarkStart w:id="23" w:name="projetos-pessoais"/>
-    <w:p>
-      <w:pPr>
-        <w:pStyle w:val="Heading2"/>
-      </w:pPr>
-      <w:r>
-        <w:t xml:space="preserve">Projetos Pessoais</w:t>
-      </w:r>
-    </w:p>
-    <w:p>
-      <w:pPr>
-        <w:pStyle w:val="FirstParagraph"/>
+        <w:t xml:space="preserve">(em produção)</w:t>
+      </w:r>
+    </w:p>
+    <w:p>
+      <w:pPr>
+        <w:pStyle w:val="BodyText"/>
+      </w:pPr>
+      <w:r>
+        <w:t xml:space="preserve">Plataforma de finanças pessoais com web app e app mobile nativos. Web: Next.js 16 + React 19 + TypeScript + Prisma + PostgreSQL · Testes com Vitest + React Testing Library · Deploy blue/green no GCP. Mobile: React Native (Android) com notificações push nativas, Firebase e Google OAuth.</w:t>
+      </w:r>
+    </w:p>
+    <w:p>
+      <w:pPr>
+        <w:pStyle w:val="BodyText"/>
       </w:pPr>
       <w:r>
         <w:rPr>
           <w:b/>
           <w:bCs/>
         </w:rPr>
-        <w:t xml:space="preserve">jeansouza.dev</w:t>
+        <w:t xml:space="preserve">Spoter</w:t>
       </w:r>
       <w:r>
         <w:t xml:space="preserve"> </w:t>
       </w:r>
       <w:r>
-        <w:t xml:space="preserve">— Site pessoal e portfólio de engenharia em Next.js 16 App Router com React Server Components, Server Actions e TypeScript. Deploy no Vercel.</w:t>
-      </w:r>
-    </w:p>
-    <w:p>
-      <w:pPr>
-        <w:pStyle w:val="BodyText"/>
-      </w:pPr>
-      <w:r>
-        <w:rPr>
-          <w:b/>
-          <w:bCs/>
-        </w:rPr>
-        <w:t xml:space="preserve">Pigui</w:t>
-      </w:r>
-      <w:r>
+        <w:rPr>
+          <w:i/>
+          <w:iCs/>
+        </w:rPr>
+        <w:t xml:space="preserve">(open source ·</w:t>
+      </w:r>
+      <w:r>
+        <w:rPr>
+          <w:i/>
+          <w:iCs/>
+        </w:rPr>
         <w:t xml:space="preserve"> </w:t>
       </w:r>
-      <w:r>
-        <w:t xml:space="preserve">— Plataforma de finanças pessoais em produção com web app e app Android nativo. Web: Next.js 16, React 19, TypeScript, Prisma ORM, PostgreSQL, Vitest + RTL, deploy blue/green no GCP. Mobile: React Native com notificações push nativas, Firebase e Google OAuth.</w:t>
-      </w:r>
-    </w:p>
-    <w:p>
-      <w:pPr>
-        <w:pStyle w:val="BodyText"/>
-      </w:pPr>
-      <w:r>
-        <w:rPr>
-          <w:b/>
-          <w:bCs/>
-        </w:rPr>
-        <w:t xml:space="preserve">Vi-Ui</w:t>
-      </w:r>
-      <w:r>
-        <w:t xml:space="preserve"> </w:t>
-      </w:r>
-      <w:r>
-        <w:t xml:space="preserve">— Biblioteca open source de componentes Vue criada na Vitta, documentada com Storybook. Base do design system da empresa.</w:t>
-      </w:r>
-      <w:r>
-        <w:t xml:space="preserve"> </w:t>
-      </w:r>
-      <w:hyperlink r:id="rId18">
+      <w:hyperlink r:id="rId24">
         <w:r>
           <w:rPr>
             <w:rStyle w:val="Hyperlink"/>
+            <w:i/>
+            <w:iCs/>
           </w:rPr>
-          <w:t xml:space="preserve">github.com/vitta-health/Vi-Ui</w:t>
+          <w:t xml:space="preserve">github.com/jeancarlos/spotify-player</w:t>
         </w:r>
       </w:hyperlink>
-    </w:p>
-    <w:p>
-      <w:r>
-        <w:pict>
-          <v:rect style="width:0;height:1.5pt" o:hralign="center" o:hrstd="t" o:hr="t"/>
-        </w:pict>
-      </w:r>
-    </w:p>
-    <w:bookmarkEnd w:id="23"/>
-    <w:bookmarkStart w:id="24" w:name="formação-acadêmica"/>
+      <w:r>
+        <w:rPr>
+          <w:i/>
+          <w:iCs/>
+        </w:rPr>
+        <w:t xml:space="preserve">)</w:t>
+      </w:r>
+    </w:p>
+    <w:p>
+      <w:pPr>
+        <w:pStyle w:val="BodyText"/>
+      </w:pPr>
+      <w:r>
+        <w:t xml:space="preserve">Player de música web imersivo integrado com a API do Spotify. React + TypeScript + Vite + Tailwind CSS + shadcn/ui com efeito glassmorfismo. Testes E2E com Playwright (7 suítes cobrindo auth, busca, favoritos, i18n e smoke tests) e unitários com Vitest.</w:t>
+      </w:r>
+    </w:p>
+    <w:bookmarkEnd w:id="25"/>
+    <w:bookmarkStart w:id="26" w:name="histórico-anterior"/>
     <w:p>
       <w:pPr>
         <w:pStyle w:val="Heading2"/>
       </w:pPr>
       <w:r>
-        <w:t xml:space="preserve">Formação Acadêmica</w:t>
+        <w:t xml:space="preserve">Histórico Anterior</w:t>
       </w:r>
     </w:p>
     <w:p>
@@ -1126,60 +895,65 @@
           <w:b/>
           <w:bCs/>
         </w:rPr>
-        <w:t xml:space="preserve">Esamc</w:t>
+        <w:t xml:space="preserve">Bockz</w:t>
       </w:r>
       <w:r>
         <w:t xml:space="preserve"> </w:t>
       </w:r>
       <w:r>
-        <w:t xml:space="preserve">— Design Gráfico (Incompleto) · janeiro de 2008 – junho de 2010</w:t>
-      </w:r>
-    </w:p>
-    <w:p>
-      <w:pPr>
-        <w:pStyle w:val="BodyText"/>
-      </w:pPr>
+        <w:t xml:space="preserve">— Desenvolvedor Full-Stack (PHP/MySQL) | set/2011 – abr/2012</w:t>
+      </w:r>
+      <w:r>
+        <w:br/>
+      </w:r>
       <w:r>
         <w:rPr>
           <w:b/>
           <w:bCs/>
         </w:rPr>
-        <w:t xml:space="preserve">EF SET Certificate 82/100 (C2 Proficient)</w:t>
+        <w:t xml:space="preserve">OpenK Tecnologia</w:t>
       </w:r>
       <w:r>
         <w:t xml:space="preserve"> </w:t>
       </w:r>
       <w:r>
-        <w:t xml:space="preserve">— proficiência em inglês, reconhecimento internacional</w:t>
-      </w:r>
-    </w:p>
-    <w:p>
-      <w:r>
-        <w:pict>
-          <v:rect style="width:0;height:1.5pt" o:hralign="center" o:hrstd="t" o:hr="t"/>
-        </w:pict>
-      </w:r>
-    </w:p>
-    <w:bookmarkEnd w:id="24"/>
-    <w:bookmarkStart w:id="25" w:name="idiomas"/>
-    <w:p>
-      <w:pPr>
-        <w:pStyle w:val="Heading2"/>
-      </w:pPr>
-      <w:r>
-        <w:t xml:space="preserve">Idiomas</w:t>
-      </w:r>
-    </w:p>
-    <w:p>
-      <w:pPr>
-        <w:pStyle w:val="FirstParagraph"/>
-      </w:pPr>
-      <w:r>
-        <w:t xml:space="preserve">Português (nativo) · Inglês C2 — EF SET 82/100</w:t>
-      </w:r>
-    </w:p>
-    <w:bookmarkEnd w:id="25"/>
+        <w:t xml:space="preserve">— Web Designer | jan/2011 – ago/2011</w:t>
+      </w:r>
+      <w:r>
+        <w:br/>
+      </w:r>
+      <w:r>
+        <w:rPr>
+          <w:b/>
+          <w:bCs/>
+        </w:rPr>
+        <w:t xml:space="preserve">Webroom Soluções Interativas</w:t>
+      </w:r>
+      <w:r>
+        <w:t xml:space="preserve"> </w:t>
+      </w:r>
+      <w:r>
+        <w:t xml:space="preserve">— Programador de Interface | nov/2008 – fev/2010</w:t>
+      </w:r>
+      <w:r>
+        <w:br/>
+      </w:r>
+      <w:r>
+        <w:rPr>
+          <w:b/>
+          <w:bCs/>
+        </w:rPr>
+        <w:t xml:space="preserve">Lalli Bureau</w:t>
+      </w:r>
+      <w:r>
+        <w:t xml:space="preserve"> </w:t>
+      </w:r>
+      <w:r>
+        <w:t xml:space="preserve">— Web Designer | abr/2008 – nov/2008</w:t>
+      </w:r>
+    </w:p>
     <w:bookmarkEnd w:id="26"/>
+    <w:bookmarkEnd w:id="27"/>
     <w:sectPr>
       <w:footnotePr>
         <w:numRestart w:val="eachSect"/>

</xml_diff>